<commit_message>
add: misreadings in IR finished
</commit_message>
<xml_diff>
--- a/My Comments/Theory of Chaos - how to behave in destabilized world order.docx
+++ b/My Comments/Theory of Chaos - how to behave in destabilized world order.docx
@@ -155,6 +155,246 @@
           <w:lang w:val="en-US"/>
         </w:rPr>
         <w:t>Historical examples of world order changes, how states behaved and who benefited from the chaos.</w:t>
+      </w:r>
+    </w:p>
+    <w:p>
+      <w:pPr>
+        <w:rPr>
+          <w:lang w:val="en-US"/>
+        </w:rPr>
+      </w:pPr>
+      <w:r>
+        <w:rPr>
+          <w:lang w:val="en-US"/>
+        </w:rPr>
+        <w:t xml:space="preserve">How to structuralise this work? </w:t>
+      </w:r>
+      <w:r>
+        <w:rPr>
+          <w:lang w:val="en-US"/>
+        </w:rPr>
+        <w:t>Should it be more problem oriented or systematic? Or to build a system that delas with specific problems?</w:t>
+      </w:r>
+      <w:r>
+        <w:rPr>
+          <w:lang w:val="en-US"/>
+        </w:rPr>
+        <w:t xml:space="preserve"> Maybe I shouldn’t bite more than I can chew, for the first article… should I rename it as a ‘small theory of the chaos’ to indicate it that this wont be a complete stage of my work?</w:t>
+      </w:r>
+    </w:p>
+    <w:p>
+      <w:pPr>
+        <w:rPr>
+          <w:lang w:val="en-US"/>
+        </w:rPr>
+      </w:pPr>
+    </w:p>
+    <w:p>
+      <w:pPr>
+        <w:rPr>
+          <w:lang w:val="en-US"/>
+        </w:rPr>
+      </w:pPr>
+      <w:r>
+        <w:rPr>
+          <w:lang w:val="en-US"/>
+        </w:rPr>
+        <w:t>According to Morgenthau the theory of international politics should answear the concerns about morality in international politics, decentralization of the law, international organisations (acceptance or non acceptance), democratic control of external politics and the prospects of diplomacy.</w:t>
+      </w:r>
+    </w:p>
+    <w:p>
+      <w:pPr>
+        <w:rPr>
+          <w:lang w:val="en-US"/>
+        </w:rPr>
+      </w:pPr>
+    </w:p>
+    <w:p>
+      <w:pPr>
+        <w:rPr>
+          <w:i/>
+          <w:iCs/>
+          <w:lang w:val="en-US"/>
+        </w:rPr>
+      </w:pPr>
+      <w:r>
+        <w:rPr>
+          <w:i/>
+          <w:iCs/>
+          <w:lang w:val="en-US"/>
+        </w:rPr>
+        <w:t>It ‘</w:t>
+      </w:r>
+      <w:r>
+        <w:rPr>
+          <w:i/>
+          <w:iCs/>
+          <w:lang w:val="en-US"/>
+        </w:rPr>
+        <w:t>is</w:t>
+      </w:r>
+    </w:p>
+    <w:p>
+      <w:pPr>
+        <w:rPr>
+          <w:i/>
+          <w:iCs/>
+          <w:lang w:val="en-US"/>
+        </w:rPr>
+      </w:pPr>
+      <w:r>
+        <w:rPr>
+          <w:i/>
+          <w:iCs/>
+          <w:lang w:val="en-US"/>
+        </w:rPr>
+        <w:t>only within [...] a philosophical framework that an empirical framework of political</w:t>
+      </w:r>
+    </w:p>
+    <w:p>
+      <w:pPr>
+        <w:rPr>
+          <w:i/>
+          <w:iCs/>
+          <w:lang w:val="en-US"/>
+        </w:rPr>
+      </w:pPr>
+      <w:r>
+        <w:rPr>
+          <w:i/>
+          <w:iCs/>
+          <w:lang w:val="en-US"/>
+        </w:rPr>
+        <w:t>inquiry can have meaning and that empirical inquiry can become fruitful'.</w:t>
+      </w:r>
+      <w:r>
+        <w:rPr>
+          <w:i/>
+          <w:iCs/>
+          <w:lang w:val="en-US"/>
+        </w:rPr>
+        <w:t>’</w:t>
+      </w:r>
+    </w:p>
+    <w:p>
+      <w:pPr>
+        <w:pStyle w:val="Akapitzlist"/>
+        <w:numPr>
+          <w:ilvl w:val="0"/>
+          <w:numId w:val="2"/>
+        </w:numPr>
+        <w:rPr>
+          <w:lang w:val="en-US"/>
+        </w:rPr>
+      </w:pPr>
+      <w:r>
+        <w:rPr>
+          <w:lang w:val="en-US"/>
+        </w:rPr>
+        <w:t xml:space="preserve">Paradigms (fundamental view of the world that is used as leanses through which world is percievied) </w:t>
+      </w:r>
+    </w:p>
+    <w:p>
+      <w:pPr>
+        <w:pStyle w:val="Akapitzlist"/>
+        <w:numPr>
+          <w:ilvl w:val="1"/>
+          <w:numId w:val="2"/>
+        </w:numPr>
+        <w:rPr>
+          <w:lang w:val="en-US"/>
+        </w:rPr>
+      </w:pPr>
+      <w:r>
+        <w:rPr>
+          <w:lang w:val="en-US"/>
+        </w:rPr>
+        <w:t xml:space="preserve">Law of the least resistance -&gt; people commit the minimal amount of energy to do things (they are not passionate about) </w:t>
+      </w:r>
+    </w:p>
+    <w:p>
+      <w:pPr>
+        <w:pStyle w:val="Akapitzlist"/>
+        <w:numPr>
+          <w:ilvl w:val="1"/>
+          <w:numId w:val="2"/>
+        </w:numPr>
+        <w:rPr>
+          <w:lang w:val="en-US"/>
+        </w:rPr>
+      </w:pPr>
+      <w:r>
+        <w:rPr>
+          <w:lang w:val="en-US"/>
+        </w:rPr>
+        <w:t>All systems are vulnerable to corrosion (entrophy) and only active prevention can shield them (for a time being)</w:t>
+      </w:r>
+    </w:p>
+    <w:p>
+      <w:pPr>
+        <w:pStyle w:val="Akapitzlist"/>
+        <w:numPr>
+          <w:ilvl w:val="1"/>
+          <w:numId w:val="2"/>
+        </w:numPr>
+        <w:rPr>
+          <w:lang w:val="en-US"/>
+        </w:rPr>
+      </w:pPr>
+      <w:r>
+        <w:rPr>
+          <w:lang w:val="en-US"/>
+        </w:rPr>
+        <w:t>Comfort is the enemy of the change, it leads to mental numbness</w:t>
+      </w:r>
+    </w:p>
+    <w:p>
+      <w:pPr>
+        <w:pStyle w:val="Akapitzlist"/>
+        <w:numPr>
+          <w:ilvl w:val="1"/>
+          <w:numId w:val="2"/>
+        </w:numPr>
+        <w:rPr>
+          <w:lang w:val="en-US"/>
+        </w:rPr>
+      </w:pPr>
+      <w:r>
+        <w:rPr>
+          <w:lang w:val="en-US"/>
+        </w:rPr>
+        <w:t xml:space="preserve">Vulcanic soil is very potent, just like soil of ruined imperium. To fix economy, sometimes you just have to go bankrupt. (how to form this into a rule??) -&gt; Limitations helps us with creative solutions but to much constraints can </w:t>
+      </w:r>
+      <w:r>
+        <w:rPr>
+          <w:lang w:val="en-US"/>
+        </w:rPr>
+        <w:lastRenderedPageBreak/>
+        <w:t>prevent any movement/change.</w:t>
+      </w:r>
+      <w:r>
+        <w:rPr>
+          <w:lang w:val="en-US"/>
+        </w:rPr>
+        <w:t xml:space="preserve"> AI models, if they are not rewarder correctly, may never learn how to do what is expected from them. On the other hand, to high limitations can revent them from finding unusual way of solving issiue (speedruners in car games that jump over the map edge) or just find technically correct but not useful solution (stay alive as long as possible, by permamently pausing the game). </w:t>
+      </w:r>
+    </w:p>
+    <w:p>
+      <w:pPr>
+        <w:pStyle w:val="Akapitzlist"/>
+        <w:numPr>
+          <w:ilvl w:val="0"/>
+          <w:numId w:val="2"/>
+        </w:numPr>
+        <w:rPr>
+          <w:lang w:val="en-US"/>
+        </w:rPr>
+      </w:pPr>
+      <w:r>
+        <w:rPr>
+          <w:lang w:val="en-US"/>
+        </w:rPr>
+        <w:t>Crisis understood as the volatile event that cannot be delt with in normal manners, triggers the process of reevaluation owns paradigms. Why this happened? Why we did not prevented it? How can we deal with it? (what about impending crisisis? Slowly marching in our direction? Do we need different world for general turmoil, volatile crisisis and structural material failure?)</w:t>
       </w:r>
     </w:p>
     <w:sectPr>
@@ -258,8 +498,132 @@
       </w:pPr>
     </w:lvl>
   </w:abstractNum>
+  <w:abstractNum w:abstractNumId="1" w15:restartNumberingAfterBreak="0">
+    <w:nsid w:val="15935231"/>
+    <w:multiLevelType w:val="multilevel"/>
+    <w:tmpl w:val="09D238A4"/>
+    <w:lvl w:ilvl="0">
+      <w:start w:val="1"/>
+      <w:numFmt w:val="decimal"/>
+      <w:lvlText w:val="%1."/>
+      <w:lvlJc w:val="left"/>
+      <w:pPr>
+        <w:ind w:left="720" w:hanging="360"/>
+      </w:pPr>
+      <w:rPr>
+        <w:rFonts w:hint="default"/>
+      </w:rPr>
+    </w:lvl>
+    <w:lvl w:ilvl="1">
+      <w:start w:val="1"/>
+      <w:numFmt w:val="decimal"/>
+      <w:isLgl/>
+      <w:lvlText w:val="%1.%2"/>
+      <w:lvlJc w:val="left"/>
+      <w:pPr>
+        <w:ind w:left="1095" w:hanging="375"/>
+      </w:pPr>
+      <w:rPr>
+        <w:rFonts w:hint="default"/>
+      </w:rPr>
+    </w:lvl>
+    <w:lvl w:ilvl="2">
+      <w:start w:val="1"/>
+      <w:numFmt w:val="decimal"/>
+      <w:isLgl/>
+      <w:lvlText w:val="%1.%2.%3"/>
+      <w:lvlJc w:val="left"/>
+      <w:pPr>
+        <w:ind w:left="1800" w:hanging="720"/>
+      </w:pPr>
+      <w:rPr>
+        <w:rFonts w:hint="default"/>
+      </w:rPr>
+    </w:lvl>
+    <w:lvl w:ilvl="3">
+      <w:start w:val="1"/>
+      <w:numFmt w:val="decimal"/>
+      <w:isLgl/>
+      <w:lvlText w:val="%1.%2.%3.%4"/>
+      <w:lvlJc w:val="left"/>
+      <w:pPr>
+        <w:ind w:left="2520" w:hanging="1080"/>
+      </w:pPr>
+      <w:rPr>
+        <w:rFonts w:hint="default"/>
+      </w:rPr>
+    </w:lvl>
+    <w:lvl w:ilvl="4">
+      <w:start w:val="1"/>
+      <w:numFmt w:val="decimal"/>
+      <w:isLgl/>
+      <w:lvlText w:val="%1.%2.%3.%4.%5"/>
+      <w:lvlJc w:val="left"/>
+      <w:pPr>
+        <w:ind w:left="2880" w:hanging="1080"/>
+      </w:pPr>
+      <w:rPr>
+        <w:rFonts w:hint="default"/>
+      </w:rPr>
+    </w:lvl>
+    <w:lvl w:ilvl="5">
+      <w:start w:val="1"/>
+      <w:numFmt w:val="decimal"/>
+      <w:isLgl/>
+      <w:lvlText w:val="%1.%2.%3.%4.%5.%6"/>
+      <w:lvlJc w:val="left"/>
+      <w:pPr>
+        <w:ind w:left="3600" w:hanging="1440"/>
+      </w:pPr>
+      <w:rPr>
+        <w:rFonts w:hint="default"/>
+      </w:rPr>
+    </w:lvl>
+    <w:lvl w:ilvl="6">
+      <w:start w:val="1"/>
+      <w:numFmt w:val="decimal"/>
+      <w:isLgl/>
+      <w:lvlText w:val="%1.%2.%3.%4.%5.%6.%7"/>
+      <w:lvlJc w:val="left"/>
+      <w:pPr>
+        <w:ind w:left="3960" w:hanging="1440"/>
+      </w:pPr>
+      <w:rPr>
+        <w:rFonts w:hint="default"/>
+      </w:rPr>
+    </w:lvl>
+    <w:lvl w:ilvl="7">
+      <w:start w:val="1"/>
+      <w:numFmt w:val="decimal"/>
+      <w:isLgl/>
+      <w:lvlText w:val="%1.%2.%3.%4.%5.%6.%7.%8"/>
+      <w:lvlJc w:val="left"/>
+      <w:pPr>
+        <w:ind w:left="4680" w:hanging="1800"/>
+      </w:pPr>
+      <w:rPr>
+        <w:rFonts w:hint="default"/>
+      </w:rPr>
+    </w:lvl>
+    <w:lvl w:ilvl="8">
+      <w:start w:val="1"/>
+      <w:numFmt w:val="decimal"/>
+      <w:isLgl/>
+      <w:lvlText w:val="%1.%2.%3.%4.%5.%6.%7.%8.%9"/>
+      <w:lvlJc w:val="left"/>
+      <w:pPr>
+        <w:ind w:left="5040" w:hanging="1800"/>
+      </w:pPr>
+      <w:rPr>
+        <w:rFonts w:hint="default"/>
+      </w:rPr>
+    </w:lvl>
+  </w:abstractNum>
   <w:num w:numId="1" w16cid:durableId="1857574207">
     <w:abstractNumId w:val="0"/>
+  </w:num>
+  <w:num w:numId="2" w16cid:durableId="596062663">
+    <w:abstractNumId w:val="1"/>
   </w:num>
 </w:numbering>
 </file>

</xml_diff>